<commit_message>
S3: intensidad Express con la opción C (D147)
01 §9.4 y 21 §2.5: elegibilidad confirmada por riesgos, mismas puertas con
G3 por separado, lista reducida de criterios (todos los «Sí ◆» y los del
núcleo), ficha viva (P01 §14), elegibilidad en P04 §5.1, R6 anual y salida
automática. T01: columna Express del catálogo, T04 con elegibilidad, alerta
«Fuera de Express»; demostración IA-2026-006. Glosario, 00, 03, 20, 22, 90,
94, 96, figura de intensidad y curso (ES/EN). Sección 39 de la verificación.

Co-Authored-By: Claude Opus 5.5 <noreply@anthropic.com>
Claude-Session: https://claude.ai/code/session_014iYio6LvvzJ7Wvzr7BZcsM
</commit_message>
<xml_diff>
--- a/SEVEN-G/docx/en/plantillas/P01_SEVEN-G_Carta_de_la_iniciativa.docx
+++ b/SEVEN-G/docx/en/plantillas/P01_SEVEN-G_Carta_de_la_iniciativa.docx
@@ -80,7 +80,7 @@
               <w:pStyle w:val="Celda"/>
             </w:pPr>
             <w:r>
-              <w:t xml:space="preserve">0.1 (working draft)</w:t>
+              <w:t xml:space="preserve">0.2 (working draft)</w:t>
             </w:r>
           </w:p>
         </w:tc>
@@ -108,7 +108,7 @@
               <w:pStyle w:val="Celda"/>
             </w:pPr>
             <w:r>
-              <w:t xml:space="preserve">16-09-2026</w:t>
+              <w:t xml:space="preserve">01-10-2026</w:t>
             </w:r>
           </w:p>
         </w:tc>
@@ -3109,7 +3109,7 @@
               <w:pStyle w:val="Celda"/>
             </w:pPr>
             <w:r>
-              <w:t xml:space="preserve">Lite · Enterprise, with the criterion that determines it (P04).</w:t>
+              <w:t xml:space="preserve">Express · Lite · Enterprise, with the criterion or eligibility that determines it (P04). If Express, section 14 is also completed.</w:t>
             </w:r>
           </w:p>
         </w:tc>
@@ -4794,15 +4794,12 @@
         <w:pStyle w:val="Heading1"/>
       </w:pPr>
       <w:r>
-        <w:t xml:space="preserve">14. Version control</w:t>
+        <w:t xml:space="preserve">14. Living record (Express intensity only)</w:t>
       </w:r>
     </w:p>
     <w:p>
       <w:r>
-        <w:rPr>
-          <w:b/>
-        </w:rPr>
-        <w:t xml:space="preserve">Completed document</w:t>
+        <w:t xml:space="preserve">In an Express initiative (01 §9.4) this section replaces the templates of phases 0 to 5: it is filled in stages and updated at each gate, and the evidence the company already has is referenced instead of copied (21 §4.3). Each row indicates the criteria of the reduced list (21 §2.5) for which it provides evidence. At Lite and Enterprise this section is not used.</w:t>
       </w:r>
     </w:p>
     <w:tbl>
@@ -4835,6 +4832,646 @@
               <w:rPr>
                 <w:b/>
               </w:rPr>
+              <w:t xml:space="preserve">Block</w:t>
+            </w:r>
+          </w:p>
+        </w:tc>
+        <w:tc>
+          <w:tcPr>
+            <w:tcW w:w="2410" w:type="dxa"/>
+            <w:shd w:val="clear" w:color="auto" w:fill="F2DFCE"/>
+          </w:tcPr>
+          <w:p>
+            <w:pPr>
+              <w:pStyle w:val="Celda"/>
+            </w:pPr>
+            <w:r>
+              <w:rPr>
+                <w:b/>
+              </w:rPr>
+              <w:t xml:space="preserve">Minimum content</w:t>
+            </w:r>
+          </w:p>
+        </w:tc>
+        <w:tc>
+          <w:tcPr>
+            <w:tcW w:w="2410" w:type="dxa"/>
+            <w:shd w:val="clear" w:color="auto" w:fill="F2DFCE"/>
+          </w:tcPr>
+          <w:p>
+            <w:pPr>
+              <w:pStyle w:val="Celda"/>
+            </w:pPr>
+            <w:r>
+              <w:rPr>
+                <w:b/>
+              </w:rPr>
+              <w:t xml:space="preserve">Criteria</w:t>
+            </w:r>
+          </w:p>
+        </w:tc>
+        <w:tc>
+          <w:tcPr>
+            <w:tcW w:w="2410" w:type="dxa"/>
+            <w:shd w:val="clear" w:color="auto" w:fill="F2DFCE"/>
+          </w:tcPr>
+          <w:p>
+            <w:pPr>
+              <w:pStyle w:val="Celda"/>
+            </w:pPr>
+            <w:r>
+              <w:rPr>
+                <w:b/>
+              </w:rPr>
+              <w:t xml:space="preserve">Completed at</w:t>
+            </w:r>
+          </w:p>
+        </w:tc>
+      </w:tr>
+      <w:tr>
+        <w:tc>
+          <w:tcPr>
+            <w:tcW w:w="2410" w:type="dxa"/>
+          </w:tcPr>
+          <w:p>
+            <w:pPr>
+              <w:pStyle w:val="Celda"/>
+            </w:pPr>
+            <w:r>
+              <w:rPr>
+                <w:b/>
+              </w:rPr>
+              <w:t xml:space="preserve">Context and opportunity</w:t>
+            </w:r>
+          </w:p>
+        </w:tc>
+        <w:tc>
+          <w:tcPr>
+            <w:tcW w:w="2410" w:type="dxa"/>
+          </w:tcPr>
+          <w:p>
+            <w:pPr>
+              <w:pStyle w:val="Celda"/>
+            </w:pPr>
+            <w:r>
+              <w:t xml:space="preserve">Business problem, process affected, non-AI alternative and why AI adds something; screening for prohibited practices.</w:t>
+            </w:r>
+          </w:p>
+        </w:tc>
+        <w:tc>
+          <w:tcPr>
+            <w:tcW w:w="2410" w:type="dxa"/>
+          </w:tcPr>
+          <w:p>
+            <w:pPr>
+              <w:pStyle w:val="Celda"/>
+            </w:pPr>
+            <w:r>
+              <w:t xml:space="preserve">G0.01, G0.04, G1.01, G1.03, G1.07</w:t>
+            </w:r>
+          </w:p>
+        </w:tc>
+        <w:tc>
+          <w:tcPr>
+            <w:tcW w:w="2410" w:type="dxa"/>
+          </w:tcPr>
+          <w:p>
+            <w:pPr>
+              <w:pStyle w:val="Celda"/>
+            </w:pPr>
+            <w:r>
+              <w:t xml:space="preserve">Entry (G0–G2)</w:t>
+            </w:r>
+          </w:p>
+        </w:tc>
+      </w:tr>
+      <w:tr>
+        <w:tc>
+          <w:tcPr>
+            <w:tcW w:w="2410" w:type="dxa"/>
+          </w:tcPr>
+          <w:p>
+            <w:pPr>
+              <w:pStyle w:val="Celda"/>
+            </w:pPr>
+            <w:r>
+              <w:rPr>
+                <w:b/>
+              </w:rPr>
+              <w:t xml:space="preserve">Express eligibility</w:t>
+            </w:r>
+          </w:p>
+        </w:tc>
+        <w:tc>
+          <w:tcPr>
+            <w:tcW w:w="2410" w:type="dxa"/>
+          </w:tcPr>
+          <w:p>
+            <w:pPr>
+              <w:pStyle w:val="Celda"/>
+            </w:pPr>
+            <w:r>
+              <w:t xml:space="preserve">The six conditions in P04 §5.1 answered "Yes" and who confirms them.</w:t>
+            </w:r>
+          </w:p>
+        </w:tc>
+        <w:tc>
+          <w:tcPr>
+            <w:tcW w:w="2410" w:type="dxa"/>
+          </w:tcPr>
+          <w:p>
+            <w:pPr>
+              <w:pStyle w:val="Celda"/>
+            </w:pPr>
+            <w:r>
+              <w:t xml:space="preserve">G0.07</w:t>
+            </w:r>
+          </w:p>
+        </w:tc>
+        <w:tc>
+          <w:tcPr>
+            <w:tcW w:w="2410" w:type="dxa"/>
+          </w:tcPr>
+          <w:p>
+            <w:pPr>
+              <w:pStyle w:val="Celda"/>
+            </w:pPr>
+            <w:r>
+              <w:t xml:space="preserve">Entry (G0–G2)</w:t>
+            </w:r>
+          </w:p>
+        </w:tc>
+      </w:tr>
+      <w:tr>
+        <w:tc>
+          <w:tcPr>
+            <w:tcW w:w="2410" w:type="dxa"/>
+          </w:tcPr>
+          <w:p>
+            <w:pPr>
+              <w:pStyle w:val="Celda"/>
+            </w:pPr>
+            <w:r>
+              <w:rPr>
+                <w:b/>
+              </w:rPr>
+              <w:t xml:space="preserve">Owners</w:t>
+            </w:r>
+          </w:p>
+        </w:tc>
+        <w:tc>
+          <w:tcPr>
+            <w:tcW w:w="2410" w:type="dxa"/>
+          </w:tcPr>
+          <w:p>
+            <w:pPr>
+              <w:pStyle w:val="Celda"/>
+            </w:pPr>
+            <w:r>
+              <w:t xml:space="preserve">Sponsor, product, technical and risk owners by name; incompatibilities checked.</w:t>
+            </w:r>
+          </w:p>
+        </w:tc>
+        <w:tc>
+          <w:tcPr>
+            <w:tcW w:w="2410" w:type="dxa"/>
+          </w:tcPr>
+          <w:p>
+            <w:pPr>
+              <w:pStyle w:val="Celda"/>
+            </w:pPr>
+            <w:r>
+              <w:t xml:space="preserve">G0.05, G0.06</w:t>
+            </w:r>
+          </w:p>
+        </w:tc>
+        <w:tc>
+          <w:tcPr>
+            <w:tcW w:w="2410" w:type="dxa"/>
+          </w:tcPr>
+          <w:p>
+            <w:pPr>
+              <w:pStyle w:val="Celda"/>
+            </w:pPr>
+            <w:r>
+              <w:t xml:space="preserve">Entry (G0–G2)</w:t>
+            </w:r>
+          </w:p>
+        </w:tc>
+      </w:tr>
+      <w:tr>
+        <w:tc>
+          <w:tcPr>
+            <w:tcW w:w="2410" w:type="dxa"/>
+          </w:tcPr>
+          <w:p>
+            <w:pPr>
+              <w:pStyle w:val="Celda"/>
+            </w:pPr>
+            <w:r>
+              <w:rPr>
+                <w:b/>
+              </w:rPr>
+              <w:t xml:space="preserve">Register and inventory</w:t>
+            </w:r>
+          </w:p>
+        </w:tc>
+        <w:tc>
+          <w:tcPr>
+            <w:tcW w:w="2410" w:type="dxa"/>
+          </w:tcPr>
+          <w:p>
+            <w:pPr>
+              <w:pStyle w:val="Celda"/>
+            </w:pPr>
+            <w:r>
+              <w:t xml:space="preserve">Code IA-YYYY-NNN and inventory record; no budget consumed before the decision.</w:t>
+            </w:r>
+          </w:p>
+        </w:tc>
+        <w:tc>
+          <w:tcPr>
+            <w:tcW w:w="2410" w:type="dxa"/>
+          </w:tcPr>
+          <w:p>
+            <w:pPr>
+              <w:pStyle w:val="Celda"/>
+            </w:pPr>
+            <w:r>
+              <w:t xml:space="preserve">G0.08, G0.09</w:t>
+            </w:r>
+          </w:p>
+        </w:tc>
+        <w:tc>
+          <w:tcPr>
+            <w:tcW w:w="2410" w:type="dxa"/>
+          </w:tcPr>
+          <w:p>
+            <w:pPr>
+              <w:pStyle w:val="Celda"/>
+            </w:pPr>
+            <w:r>
+              <w:t xml:space="preserve">Entry (G0–G2)</w:t>
+            </w:r>
+          </w:p>
+        </w:tc>
+      </w:tr>
+      <w:tr>
+        <w:tc>
+          <w:tcPr>
+            <w:tcW w:w="2410" w:type="dxa"/>
+          </w:tcPr>
+          <w:p>
+            <w:pPr>
+              <w:pStyle w:val="Celda"/>
+            </w:pPr>
+            <w:r>
+              <w:rPr>
+                <w:b/>
+              </w:rPr>
+              <w:t xml:space="preserve">Value hypothesis</w:t>
+            </w:r>
+          </w:p>
+        </w:tc>
+        <w:tc>
+          <w:tcPr>
+            <w:tcW w:w="2410" w:type="dxa"/>
+          </w:tcPr>
+          <w:p>
+            <w:pPr>
+              <w:pStyle w:val="Celda"/>
+            </w:pPr>
+            <w:r>
+              <w:t xml:space="preserve">What changes, in which metric, by how much and when; measured baseline; value with formula; stop criterion with threshold and date.</w:t>
+            </w:r>
+          </w:p>
+        </w:tc>
+        <w:tc>
+          <w:tcPr>
+            <w:tcW w:w="2410" w:type="dxa"/>
+          </w:tcPr>
+          <w:p>
+            <w:pPr>
+              <w:pStyle w:val="Celda"/>
+            </w:pPr>
+            <w:r>
+              <w:t xml:space="preserve">G2.01, G2.03, G2.04, G2.06, G2.08</w:t>
+            </w:r>
+          </w:p>
+        </w:tc>
+        <w:tc>
+          <w:tcPr>
+            <w:tcW w:w="2410" w:type="dxa"/>
+          </w:tcPr>
+          <w:p>
+            <w:pPr>
+              <w:pStyle w:val="Celda"/>
+            </w:pPr>
+            <w:r>
+              <w:t xml:space="preserve">Entry (G0–G2)</w:t>
+            </w:r>
+          </w:p>
+        </w:tc>
+      </w:tr>
+      <w:tr>
+        <w:tc>
+          <w:tcPr>
+            <w:tcW w:w="2410" w:type="dxa"/>
+          </w:tcPr>
+          <w:p>
+            <w:pPr>
+              <w:pStyle w:val="Celda"/>
+            </w:pPr>
+            <w:r>
+              <w:rPr>
+                <w:b/>
+              </w:rPr>
+              <w:t xml:space="preserve">Risk and compliance</w:t>
+            </w:r>
+          </w:p>
+        </w:tc>
+        <w:tc>
+          <w:tcPr>
+            <w:tcW w:w="2410" w:type="dxa"/>
+          </w:tcPr>
+          <w:p>
+            <w:pPr>
+              <w:pStyle w:val="Celda"/>
+            </w:pPr>
+            <w:r>
+              <w:t xml:space="preserve">Regulatory classification, legal basis if there is personal data, risks assessed with the scale in document 33 (in T06) and plan for High risks; [GEN] generative AI risks and autonomy; [TER] minimum clauses with the supplier.</w:t>
+            </w:r>
+          </w:p>
+        </w:tc>
+        <w:tc>
+          <w:tcPr>
+            <w:tcW w:w="2410" w:type="dxa"/>
+          </w:tcPr>
+          <w:p>
+            <w:pPr>
+              <w:pStyle w:val="Celda"/>
+            </w:pPr>
+            <w:r>
+              <w:t xml:space="preserve">G3.03, G3.06–G3.09, G3.11–G3.13 and the "Yes ◆" criteria of [GEN] and [TER]</w:t>
+            </w:r>
+          </w:p>
+        </w:tc>
+        <w:tc>
+          <w:tcPr>
+            <w:tcW w:w="2410" w:type="dxa"/>
+          </w:tcPr>
+          <w:p>
+            <w:pPr>
+              <w:pStyle w:val="Celda"/>
+            </w:pPr>
+            <w:r>
+              <w:t xml:space="preserve">G3</w:t>
+            </w:r>
+          </w:p>
+        </w:tc>
+      </w:tr>
+      <w:tr>
+        <w:tc>
+          <w:tcPr>
+            <w:tcW w:w="2410" w:type="dxa"/>
+          </w:tcPr>
+          <w:p>
+            <w:pPr>
+              <w:pStyle w:val="Celda"/>
+            </w:pPr>
+            <w:r>
+              <w:rPr>
+                <w:b/>
+              </w:rPr>
+              <w:t xml:space="preserve">Minimum design and testing</w:t>
+            </w:r>
+          </w:p>
+        </w:tc>
+        <w:tc>
+          <w:tcPr>
+            <w:tcW w:w="2410" w:type="dxa"/>
+          </w:tcPr>
+          <w:p>
+            <w:pPr>
+              <w:pStyle w:val="Celda"/>
+            </w:pPr>
+            <w:r>
+              <w:t xml:space="preserve">Human oversight, transparency, security and traceability; test results and robustness tests; [GEN] evaluation and defences.</w:t>
+            </w:r>
+          </w:p>
+        </w:tc>
+        <w:tc>
+          <w:tcPr>
+            <w:tcW w:w="2410" w:type="dxa"/>
+          </w:tcPr>
+          <w:p>
+            <w:pPr>
+              <w:pStyle w:val="Celda"/>
+            </w:pPr>
+            <w:r>
+              <w:t xml:space="preserve">The "Yes ◆" criteria of G4 and G5</w:t>
+            </w:r>
+          </w:p>
+        </w:tc>
+        <w:tc>
+          <w:tcPr>
+            <w:tcW w:w="2410" w:type="dxa"/>
+          </w:tcPr>
+          <w:p>
+            <w:pPr>
+              <w:pStyle w:val="Celda"/>
+            </w:pPr>
+            <w:r>
+              <w:t xml:space="preserve">Go-live (G4–G5)</w:t>
+            </w:r>
+          </w:p>
+        </w:tc>
+      </w:tr>
+      <w:tr>
+        <w:tc>
+          <w:tcPr>
+            <w:tcW w:w="2410" w:type="dxa"/>
+          </w:tcPr>
+          <w:p>
+            <w:pPr>
+              <w:pStyle w:val="Celda"/>
+            </w:pPr>
+            <w:r>
+              <w:rPr>
+                <w:b/>
+              </w:rPr>
+              <w:t xml:space="preserve">Rollback and operation</w:t>
+            </w:r>
+          </w:p>
+        </w:tc>
+        <w:tc>
+          <w:tcPr>
+            <w:tcW w:w="2410" w:type="dxa"/>
+          </w:tcPr>
+          <w:p>
+            <w:pPr>
+              <w:pStyle w:val="Celda"/>
+            </w:pPr>
+            <w:r>
+              <w:t xml:space="preserve">Stop mechanism, rollback plan tested with its actual time, incident plan and literacy of those who use the system.</w:t>
+            </w:r>
+          </w:p>
+        </w:tc>
+        <w:tc>
+          <w:tcPr>
+            <w:tcW w:w="2410" w:type="dxa"/>
+          </w:tcPr>
+          <w:p>
+            <w:pPr>
+              <w:pStyle w:val="Celda"/>
+            </w:pPr>
+            <w:r>
+              <w:t xml:space="preserve">G4.09, G5.11, G5.17, G5.19</w:t>
+            </w:r>
+          </w:p>
+        </w:tc>
+        <w:tc>
+          <w:tcPr>
+            <w:tcW w:w="2410" w:type="dxa"/>
+          </w:tcPr>
+          <w:p>
+            <w:pPr>
+              <w:pStyle w:val="Celda"/>
+            </w:pPr>
+            <w:r>
+              <w:t xml:space="preserve">Go-live (G4–G5)</w:t>
+            </w:r>
+          </w:p>
+        </w:tc>
+      </w:tr>
+      <w:tr>
+        <w:tc>
+          <w:tcPr>
+            <w:tcW w:w="2410" w:type="dxa"/>
+          </w:tcPr>
+          <w:p>
+            <w:pPr>
+              <w:pStyle w:val="Celda"/>
+            </w:pPr>
+            <w:r>
+              <w:rPr>
+                <w:b/>
+              </w:rPr>
+              <w:t xml:space="preserve">Approval</w:t>
+            </w:r>
+          </w:p>
+        </w:tc>
+        <w:tc>
+          <w:tcPr>
+            <w:tcW w:w="2410" w:type="dxa"/>
+          </w:tcPr>
+          <w:p>
+            <w:pPr>
+              <w:pStyle w:val="Celda"/>
+            </w:pPr>
+            <w:r>
+              <w:t xml:space="preserve">Date and decision of each gate with risk clearance at G3, G4 and G5 (in T01).</w:t>
+            </w:r>
+          </w:p>
+        </w:tc>
+        <w:tc>
+          <w:tcPr>
+            <w:tcW w:w="2410" w:type="dxa"/>
+          </w:tcPr>
+          <w:p>
+            <w:pPr>
+              <w:pStyle w:val="Celda"/>
+            </w:pPr>
+            <w:r>
+              <w:t xml:space="preserve">G5.22, G5.23</w:t>
+            </w:r>
+          </w:p>
+        </w:tc>
+        <w:tc>
+          <w:tcPr>
+            <w:tcW w:w="2410" w:type="dxa"/>
+          </w:tcPr>
+          <w:p>
+            <w:pPr>
+              <w:pStyle w:val="Celda"/>
+            </w:pPr>
+            <w:r>
+              <w:t xml:space="preserve">Each gate</w:t>
+            </w:r>
+          </w:p>
+        </w:tc>
+      </w:tr>
+    </w:tbl>
+    <w:p>
+      <w:pPr>
+        <w:pStyle w:val="Espacio"/>
+      </w:pPr>
+    </w:p>
+    <w:p>
+      <w:pPr>
+        <w:pStyle w:val="Cita"/>
+      </w:pPr>
+      <w:r>
+        <w:rPr>
+          <w:b/>
+        </w:rPr>
+        <w:t xml:space="preserve">Why it matters.</w:t>
+      </w:r>
+      <w:r>
+        <w:t xml:space="preserve"> A small initiative that had to fill in thirty templates would end up not being registered. The living record keeps in a single document everything the core requires and an audit asks to see, without asking for anything twice.</w:t>
+      </w:r>
+    </w:p>
+    <w:p>
+      <w:pPr>
+        <w:pStyle w:val="Separador"/>
+      </w:pPr>
+    </w:p>
+    <w:p>
+      <w:pPr>
+        <w:pStyle w:val="Heading1"/>
+      </w:pPr>
+      <w:r>
+        <w:t xml:space="preserve">15. Version control</w:t>
+      </w:r>
+    </w:p>
+    <w:p>
+      <w:r>
+        <w:rPr>
+          <w:b/>
+        </w:rPr>
+        <w:t xml:space="preserve">Completed document</w:t>
+      </w:r>
+    </w:p>
+    <w:tbl>
+      <w:tblPr>
+        <w:tblStyle w:val="TablaSG"/>
+        <w:tblW w:w="5000" w:type="pct"/>
+        <w:tblLayout w:type="autofit"/>
+        <w:tblLook w:val="04A0" w:firstRow="1" w:lastRow="0" w:firstColumn="0" w:lastColumn="0" w:noHBand="1" w:noVBand="1"/>
+      </w:tblPr>
+      <w:tblGrid>
+        <w:gridCol w:w="2410"/>
+        <w:gridCol w:w="2410"/>
+        <w:gridCol w:w="2410"/>
+        <w:gridCol w:w="2410"/>
+      </w:tblGrid>
+      <w:tr>
+        <w:trPr>
+          <w:tblHeader/>
+        </w:trPr>
+        <w:tc>
+          <w:tcPr>
+            <w:tcW w:w="2410" w:type="dxa"/>
+            <w:shd w:val="clear" w:color="auto" w:fill="F2DFCE"/>
+          </w:tcPr>
+          <w:p>
+            <w:pPr>
+              <w:pStyle w:val="Celda"/>
+            </w:pPr>
+            <w:r>
+              <w:rPr>
+                <w:b/>
+              </w:rPr>
               <w:t xml:space="preserve">Version</w:t>
             </w:r>
           </w:p>
@@ -5052,6 +5689,47 @@
             </w:pPr>
             <w:r>
               <w:t xml:space="preserve">First version. Structure aligned with 01 §6.2 and with the controlled taxonomy of 03 §3.3.</w:t>
+            </w:r>
+          </w:p>
+        </w:tc>
+      </w:tr>
+      <w:tr>
+        <w:tc>
+          <w:tcPr>
+            <w:tcW w:w="3213" w:type="dxa"/>
+          </w:tcPr>
+          <w:p>
+            <w:pPr>
+              <w:pStyle w:val="Celda"/>
+            </w:pPr>
+            <w:r>
+              <w:t xml:space="preserve">0.2</w:t>
+            </w:r>
+          </w:p>
+        </w:tc>
+        <w:tc>
+          <w:tcPr>
+            <w:tcW w:w="3213" w:type="dxa"/>
+          </w:tcPr>
+          <w:p>
+            <w:pPr>
+              <w:pStyle w:val="Celda"/>
+            </w:pPr>
+            <w:r>
+              <w:t xml:space="preserve">01-10-2026</w:t>
+            </w:r>
+          </w:p>
+        </w:tc>
+        <w:tc>
+          <w:tcPr>
+            <w:tcW w:w="3213" w:type="dxa"/>
+          </w:tcPr>
+          <w:p>
+            <w:pPr>
+              <w:pStyle w:val="Celda"/>
+            </w:pPr>
+            <w:r>
+              <w:t xml:space="preserve">New section 14, living record of Express initiatives (01 §9.4), which replaces the templates of phases 0 to 5 with the criteria of the reduced list (21 §2.5).</w:t>
             </w:r>
           </w:p>
         </w:tc>

</xml_diff>